<commit_message>
Refresh user guide with range-delete and undo/redo sections
Section 9 (Excel-style buffer work) gains a subsection on clearing
actor assignments via Delete on a rectangular selection. A new section
10 covers Cmd+Z / Cmd+Shift+Z — what counts as one undoable operation
(single edit vs. paste vs. range-delete) and the scope limits
(actor-only, page-session-only, suspended while typing in a field).
Subsequent sections renumbered.

Co-Authored-By: Claude Opus 4.7 (1M context) <noreply@anthropic.com>
</commit_message>
<xml_diff>
--- a/docs/DubStudio_Guide.docx
+++ b/docs/DubStudio_Guide.docx
@@ -511,10 +511,94 @@
     </w:p>
     <w:p>
       <w:pPr>
+        <w:pStyle w:val="Heading3"/>
+      </w:pPr>
+      <w:r>
+        <w:t>Очистка актёров на выделении</w:t>
+      </w:r>
+    </w:p>
+    <w:p>
+      <w:r>
+        <w:t>При активном прямоугольном выделении нажми Delete (или Backspace) — появится подтверждение «Clear actor assignment for N character(s)?». На OK все ячейки Actor в выделении очистятся (assignments снимутся). Ячейки других колонок (Character, E0N, Total, EPs) игнорируются — они не редактируются этим жестом. Если фокус сейчас в каком-то поле ввода, Delete работает как обычно (удаляет символ), не задевая выделение.</w:t>
+      </w:r>
+    </w:p>
+    <w:p>
+      <w:pPr>
         <w:pStyle w:val="Heading2"/>
       </w:pPr>
       <w:r>
-        <w:t>10. Список проектов</w:t>
+        <w:t>10. Undo / Redo</w:t>
+      </w:r>
+    </w:p>
+    <w:p>
+      <w:r>
+        <w:t>Cmd+Z (Mac) или Ctrl+Z (Windows/Linux) откатывают последнюю правку актёра. Cmd+Shift+Z / Ctrl+Shift+Z (или Ctrl+Y) — redo.</w:t>
+      </w:r>
+    </w:p>
+    <w:p>
+      <w:r>
+        <w:t>Что считается одной операцией:</w:t>
+      </w:r>
+    </w:p>
+    <w:p>
+      <w:pPr>
+        <w:pStyle w:val="ListBullet"/>
+      </w:pPr>
+      <w:r>
+        <w:t>Правка одной ячейки Actor — одна операция.</w:t>
+      </w:r>
+    </w:p>
+    <w:p>
+      <w:pPr>
+        <w:pStyle w:val="ListBullet"/>
+      </w:pPr>
+      <w:r>
+        <w:t>Вставка колонки из буфера (Cmd+V) — одна операция, независимо от количества заполненных строк. Один Cmd+Z откатит весь paste разом.</w:t>
+      </w:r>
+    </w:p>
+    <w:p>
+      <w:pPr>
+        <w:pStyle w:val="ListBullet"/>
+      </w:pPr>
+      <w:r>
+        <w:t>Очистка диапазона через Delete — тоже одна операция, Cmd+Z вернёт всех актёров.</w:t>
+      </w:r>
+    </w:p>
+    <w:p>
+      <w:r>
+        <w:t>Ограничения:</w:t>
+      </w:r>
+    </w:p>
+    <w:p>
+      <w:pPr>
+        <w:pStyle w:val="ListBullet"/>
+      </w:pPr>
+      <w:r>
+        <w:t>Скоуп — только actor-правки. Ручная правка word count, merge / delete / acknowledge персонажей, импорт серий под undo не подпадают.</w:t>
+      </w:r>
+    </w:p>
+    <w:p>
+      <w:pPr>
+        <w:pStyle w:val="ListBullet"/>
+      </w:pPr>
+      <w:r>
+        <w:t>Стек живёт в рамках одной открытой страницы. Перезагрузка (F5) или переход в другой проект — стек обнуляется.</w:t>
+      </w:r>
+    </w:p>
+    <w:p>
+      <w:pPr>
+        <w:pStyle w:val="ListBullet"/>
+      </w:pPr>
+      <w:r>
+        <w:t>Когда фокус в каком-то поле ввода, Cmd+Z работает по-обычному (откатывает ввод символов в этом поле). Чтобы вызвать undo по нашему стеку — кликни мимо инпутов.</w:t>
+      </w:r>
+    </w:p>
+    <w:p>
+      <w:pPr>
+        <w:pStyle w:val="Heading2"/>
+      </w:pPr>
+      <w:r>
+        <w:t>11. Список проектов</w:t>
       </w:r>
     </w:p>
     <w:p>
@@ -551,7 +635,7 @@
         <w:pStyle w:val="Heading2"/>
       </w:pPr>
       <w:r>
-        <w:t>11. Админка</w:t>
+        <w:t>12. Админка</w:t>
       </w:r>
     </w:p>
     <w:p>
@@ -633,7 +717,7 @@
         <w:pStyle w:val="Heading2"/>
       </w:pPr>
       <w:r>
-        <w:t>12. Полезные подсказки</w:t>
+        <w:t>13. Полезные подсказки</w:t>
       </w:r>
     </w:p>
     <w:p>

</xml_diff>

<commit_message>
Document multi-actor cells in the user guide
Note that the Actor cell now accepts a comma-separated list, that
duplicate / unknown names are handled (auto-create + case-insensitive
dedup), that there's a hover tooltip stacking the list, and that
массовка characters are skipped by the bookkeeper report until the
payout rule is decided.

Co-Authored-By: Claude Opus 4.7 (1M context) <noreply@anthropic.com>
</commit_message>
<xml_diff>
--- a/docs/DubStudio_Guide.docx
+++ b/docs/DubStudio_Guide.docx
@@ -345,6 +345,22 @@
       </w:pPr>
       <w:r>
         <w:t>Редактирование актёра: клик в ячейку Actor → введи имя → blur (клик в другое место) или Enter сохраняет. Escape отменяет.</w:t>
+      </w:r>
+    </w:p>
+    <w:p>
+      <w:pPr>
+        <w:pStyle w:val="ListBullet"/>
+      </w:pPr>
+      <w:r>
+        <w:t>Несколько актёров на персонаже (массовка / групповые сцены): вводи имена через запятую — «Иванов, Петров, Сидоров». Дубликаты внутри ячейки игнорируются (без учёта регистра). Незнакомые имена создаются автоматически — будь внимателен с опечатками. При наведении на такую ячейку всплывает подсказка со списком имён в столбик.</w:t>
+      </w:r>
+    </w:p>
+    <w:p>
+      <w:pPr>
+        <w:pStyle w:val="ListBullet"/>
+      </w:pPr>
+      <w:r>
+        <w:t>Массовка пока НЕ попадает в репорт по словам — правила оплаты ещё не зафиксированы. В репорте учитываются только персонажи с одним актёром.</w:t>
       </w:r>
     </w:p>
     <w:p>

</xml_diff>